<commit_message>
Read the mark with a decoder that can actually read it, and print it crisply
</commit_message>
<xml_diff>
--- a/assets/northpost-invoice.docx
+++ b/assets/northpost-invoice.docx
@@ -13,7 +13,7 @@
           <w:b/>
           <w:sz w:val="40"/>
         </w:rPr>
-        <w:t>NORTHPOST</w:t>
+        <w:t>{!Invoice.PayeeMark}</w:t>
       </w:r>
     </w:p>
     <w:p>
@@ -27,7 +27,7 @@
           <w:b w:val="0"/>
           <w:sz w:val="18"/>
         </w:rPr>
-        <w:t>Northpost Freight Services  ·  northpost.dev</w:t>
+        <w:t>{!Invoice.PayeeName}  ·  {!Invoice.PayeeDomain}</w:t>
       </w:r>
     </w:p>
     <w:p>
@@ -293,7 +293,7 @@
           <w:b w:val="0"/>
           <w:sz w:val="16"/>
         </w:rPr>
-        <w:t>The key is published at _signet.northpost.dev. Check it with dig and openssl, without an account here.</w:t>
+        <w:t>The key is published at _signet.{!Invoice.PayeeDomain}. Check it with dig and openssl, without an account here.</w:t>
       </w:r>
     </w:p>
     <w:sectPr>

</xml_diff>

<commit_message>
Give the project a front door, and fill the invoice page the way a real one is filled
</commit_message>
<xml_diff>
--- a/assets/northpost-invoice.docx
+++ b/assets/northpost-invoice.docx
@@ -284,6 +284,104 @@
     </w:p>
     <w:p>
       <w:pPr>
+        <w:spacing w:after="520"/>
+        <w:jc w:val="left"/>
+      </w:pPr>
+      <w:r>
+        <w:rPr>
+          <w:rFonts w:ascii="Helvetica" w:hAnsi="Helvetica"/>
+          <w:b w:val="0"/>
+          <w:sz w:val="16"/>
+        </w:rPr>
+        <w:t>The key is published at _signet.{!Invoice.PayeeDomain}. Check it with dig and openssl, without an account here.</w:t>
+      </w:r>
+    </w:p>
+    <w:p>
+      <w:pPr>
+        <w:spacing w:after="80"/>
+        <w:jc w:val="left"/>
+      </w:pPr>
+      <w:r>
+        <w:rPr>
+          <w:rFonts w:ascii="Helvetica" w:hAnsi="Helvetica"/>
+          <w:b/>
+          <w:sz w:val="18"/>
+        </w:rPr>
+        <w:t>PAYMENT TERMS</w:t>
+      </w:r>
+    </w:p>
+    <w:p>
+      <w:pPr>
+        <w:spacing w:after="200"/>
+        <w:jc w:val="left"/>
+      </w:pPr>
+      <w:r>
+        <w:rPr>
+          <w:rFonts w:ascii="Helvetica" w:hAnsi="Helvetica"/>
+          <w:b w:val="0"/>
+          <w:sz w:val="18"/>
+        </w:rPr>
+        <w:t>Net 30 days from the date of issue. Interest on overdue amounts accrues at 8 percent above base rate from the day after the due date.</w:t>
+      </w:r>
+    </w:p>
+    <w:p>
+      <w:pPr>
+        <w:spacing w:after="80"/>
+        <w:jc w:val="left"/>
+      </w:pPr>
+      <w:r>
+        <w:rPr>
+          <w:rFonts w:ascii="Helvetica" w:hAnsi="Helvetica"/>
+          <w:b/>
+          <w:sz w:val="18"/>
+        </w:rPr>
+        <w:t>REMITTANCE</w:t>
+      </w:r>
+    </w:p>
+    <w:p>
+      <w:pPr>
+        <w:spacing w:after="200"/>
+        <w:jc w:val="left"/>
+      </w:pPr>
+      <w:r>
+        <w:rPr>
+          <w:rFonts w:ascii="Helvetica" w:hAnsi="Helvetica"/>
+          <w:b w:val="0"/>
+          <w:sz w:val="18"/>
+        </w:rPr>
+        <w:t>Quote {!Invoice.Number} as the payment reference. Send remittance advice to accounts@{!Invoice.PayeeDomain}. Payments without a reference are held unallocated.</w:t>
+      </w:r>
+    </w:p>
+    <w:p>
+      <w:pPr>
+        <w:spacing w:after="80"/>
+        <w:jc w:val="left"/>
+      </w:pPr>
+      <w:r>
+        <w:rPr>
+          <w:rFonts w:ascii="Helvetica" w:hAnsi="Helvetica"/>
+          <w:b/>
+          <w:sz w:val="18"/>
+        </w:rPr>
+        <w:t>QUERIES</w:t>
+      </w:r>
+    </w:p>
+    <w:p>
+      <w:pPr>
+        <w:spacing w:after="200"/>
+        <w:jc w:val="left"/>
+      </w:pPr>
+      <w:r>
+        <w:rPr>
+          <w:rFonts w:ascii="Helvetica" w:hAnsi="Helvetica"/>
+          <w:b w:val="0"/>
+          <w:sz w:val="18"/>
+        </w:rPr>
+        <w:t>Raise any query within 14 days of the invoice date, quoting the invoice number. Bank details are never amended by email or telephone. A request to pay a different account is a fraud attempt and should be reported.</w:t>
+      </w:r>
+    </w:p>
+    <w:p>
+      <w:pPr>
         <w:spacing w:after="0"/>
         <w:jc w:val="left"/>
       </w:pPr>
@@ -293,7 +391,7 @@
           <w:b w:val="0"/>
           <w:sz w:val="16"/>
         </w:rPr>
-        <w:t>The key is published at _signet.{!Invoice.PayeeDomain}. Check it with dig and openssl, without an account here.</w:t>
+        <w:t>{!Invoice.PayeeName}  ·  {!Invoice.PayeeDomain}  ·  page 1 of 1</w:t>
       </w:r>
     </w:p>
     <w:sectPr>

</xml_diff>

<commit_message>
Stop printing the signed fields on the page, and give each tester their own documents
</commit_message>
<xml_diff>
--- a/assets/northpost-invoice.docx
+++ b/assets/northpost-invoice.docx
@@ -270,20 +270,6 @@
     </w:p>
     <w:p>
       <w:pPr>
-        <w:spacing w:after="40"/>
-        <w:jc w:val="left"/>
-      </w:pPr>
-      <w:r>
-        <w:rPr>
-          <w:rFonts w:ascii="Courier New" w:hAnsi="Courier New"/>
-          <w:b w:val="0"/>
-          <w:sz w:val="12"/>
-        </w:rPr>
-        <w:t>{!Invoice.SignetMark}</w:t>
-      </w:r>
-    </w:p>
-    <w:p>
-      <w:pPr>
         <w:spacing w:after="520"/>
         <w:jc w:val="left"/>
       </w:pPr>
@@ -293,7 +279,7 @@
           <w:b w:val="0"/>
           <w:sz w:val="16"/>
         </w:rPr>
-        <w:t>The key is published at _signet.{!Invoice.PayeeDomain}. Check it with dig and openssl, without an account here.</w:t>
+        <w:t>Scan the code for the signature. The key is published at _signet.{!Invoice.PayeeDomain}. Check it with dig and openssl, without an account here.</w:t>
       </w:r>
     </w:p>
     <w:p>

</xml_diff>